<commit_message>
vault backup: 2026-09-16 21:12:34
</commit_message>
<xml_diff>
--- a/Учеба 5 семестр/КРИПТА/1 ЛАБ/Отчет.docx
+++ b/Учеба 5 семестр/КРИПТА/1 ЛАБ/Отчет.docx
@@ -522,15 +522,7 @@
           <w:sz w:val="28"/>
           <w:szCs w:val="28"/>
         </w:rPr>
-        <w:t>криптографии</w:t>
-      </w:r>
-      <w:r>
-        <w:rPr>
-          <w:spacing w:val="-2"/>
-          <w:sz w:val="28"/>
-          <w:szCs w:val="28"/>
-        </w:rPr>
-        <w:t>»</w:t>
+        <w:t>криптографии»</w:t>
       </w:r>
     </w:p>
     <w:p>
@@ -916,23 +908,7 @@
           <w:sz w:val="28"/>
           <w:szCs w:val="28"/>
         </w:rPr>
-        <w:t xml:space="preserve">Для каждой пары чисел из варианта задания найти наибольший общий делитель и его линейное представление, используя </w:t>
-      </w:r>
-      <w:proofErr w:type="spellStart"/>
-      <w:r>
-        <w:rPr>
-          <w:sz w:val="28"/>
-          <w:szCs w:val="28"/>
-        </w:rPr>
-        <w:t>следуюющие</w:t>
-      </w:r>
-      <w:proofErr w:type="spellEnd"/>
-      <w:r>
-        <w:rPr>
-          <w:sz w:val="28"/>
-          <w:szCs w:val="28"/>
-        </w:rPr>
-        <w:t xml:space="preserve"> </w:t>
+        <w:t xml:space="preserve">Для каждой пары чисел из варианта задания найти наибольший общий делитель и его линейное представление, используя следуюющие </w:t>
       </w:r>
       <w:r>
         <w:rPr>
@@ -1240,23 +1216,7 @@
         <w:rPr>
           <w:sz w:val="28"/>
         </w:rPr>
-        <w:t> – находит НОД пары чисел (</w:t>
-      </w:r>
-      <w:proofErr w:type="spellStart"/>
-      <w:proofErr w:type="gramStart"/>
-      <w:r>
-        <w:rPr>
-          <w:sz w:val="28"/>
-        </w:rPr>
-        <w:t>a,b</w:t>
-      </w:r>
-      <w:proofErr w:type="spellEnd"/>
-      <w:proofErr w:type="gramEnd"/>
-      <w:r>
-        <w:rPr>
-          <w:sz w:val="28"/>
-        </w:rPr>
-        <w:t xml:space="preserve">). </w:t>
+        <w:t xml:space="preserve"> – находит НОД пары чисел (a,b). </w:t>
       </w:r>
     </w:p>
     <w:p>
@@ -1282,51 +1242,7 @@
         <w:rPr>
           <w:sz w:val="28"/>
         </w:rPr>
-        <w:t>- расширенная версия, которая вдобавок к НОД считает пару коэффициентов u, v таких, что НОД(</w:t>
-      </w:r>
-      <w:proofErr w:type="spellStart"/>
-      <w:proofErr w:type="gramStart"/>
-      <w:r>
-        <w:rPr>
-          <w:sz w:val="28"/>
-        </w:rPr>
-        <w:t>a,b</w:t>
-      </w:r>
-      <w:proofErr w:type="spellEnd"/>
-      <w:proofErr w:type="gramEnd"/>
-      <w:r>
-        <w:rPr>
-          <w:sz w:val="28"/>
-        </w:rPr>
-        <w:t xml:space="preserve">) = </w:t>
-      </w:r>
-      <w:proofErr w:type="spellStart"/>
-      <w:r>
-        <w:rPr>
-          <w:sz w:val="28"/>
-        </w:rPr>
-        <w:t>u·a</w:t>
-      </w:r>
-      <w:proofErr w:type="spellEnd"/>
-      <w:r>
-        <w:rPr>
-          <w:sz w:val="28"/>
-        </w:rPr>
-        <w:t xml:space="preserve"> + </w:t>
-      </w:r>
-      <w:proofErr w:type="spellStart"/>
-      <w:r>
-        <w:rPr>
-          <w:sz w:val="28"/>
-        </w:rPr>
-        <w:t>v·b</w:t>
-      </w:r>
-      <w:proofErr w:type="spellEnd"/>
-      <w:r>
-        <w:rPr>
-          <w:sz w:val="28"/>
-        </w:rPr>
-        <w:t>.</w:t>
+        <w:t>- расширенная версия, которая вдобавок к НОД считает пару коэффициентов u, v таких, что НОД(a,b) = u·a + v·b.</w:t>
       </w:r>
     </w:p>
     <w:p>
@@ -4372,13 +4288,8 @@
         <w:spacing w:before="108"/>
         <w:jc w:val="both"/>
       </w:pPr>
-      <w:proofErr w:type="gramStart"/>
-      <w:r>
-        <w:t>НОД(</w:t>
-      </w:r>
-      <w:proofErr w:type="gramEnd"/>
-      <w:r>
-        <w:t>1а, 1б) = 8743126037 = (−483443118)×1а + 3409294855×1б</w:t>
+      <w:r>
+        <w:t>НОД(1а, 1б) = 8743126037 = (−483443118)×1а + 3409294855×1б</w:t>
       </w:r>
       <w:r>
         <w:t>.</w:t>
@@ -5874,7 +5785,6 @@
     </w:tbl>
     <w:p>
       <w:pPr>
-        <w:pStyle w:val="20"/>
         <w:spacing w:before="108"/>
         <w:jc w:val="both"/>
       </w:pPr>
@@ -5935,10 +5845,7 @@
         <w:t>б</w:t>
       </w:r>
       <w:r>
-        <w:t>)</w:t>
-      </w:r>
-      <w:r>
-        <w:t>.</w:t>
+        <w:t>).</w:t>
       </w:r>
     </w:p>
     <w:p>
@@ -5952,15 +5859,7 @@
         <w:t xml:space="preserve">НОД(2а,2б) = </w:t>
       </w:r>
       <w:r>
-        <w:t>30876977401637594503 = 3085669097721263226×2а + (−</w:t>
-      </w:r>
-      <w:proofErr w:type="gramStart"/>
-      <w:r>
-        <w:t>8190453281403564065)×</w:t>
-      </w:r>
-      <w:proofErr w:type="gramEnd"/>
-      <w:r>
-        <w:t>2б.</w:t>
+        <w:t>30876977401637594503 = 3085669097721263226×2а + (−8190453281403564065)×2б.</w:t>
       </w:r>
     </w:p>
     <w:p>
@@ -8671,21 +8570,12 @@
           <w:szCs w:val="28"/>
         </w:rPr>
       </w:pPr>
-      <w:proofErr w:type="gramStart"/>
-      <w:r>
-        <w:rPr>
-          <w:sz w:val="28"/>
-          <w:szCs w:val="28"/>
-        </w:rPr>
-        <w:t>НОД(</w:t>
-      </w:r>
-      <w:proofErr w:type="gramEnd"/>
-      <w:r>
-        <w:rPr>
-          <w:sz w:val="28"/>
-          <w:szCs w:val="28"/>
-        </w:rPr>
-        <w:t>3а, 3б) = 9947196241514273871557554821948771026521 = (−444607229851835625082808735769956835954)×3а + 73194006399549747272884706990611853645×3б.</w:t>
+      <w:r>
+        <w:rPr>
+          <w:sz w:val="28"/>
+          <w:szCs w:val="28"/>
+        </w:rPr>
+        <w:t>НОД(3а, 3б) = 9947196241514273871557554821948771026521 = (−444607229851835625082808735769956835954)×3а + 73194006399549747272884706990611853645×3б.</w:t>
       </w:r>
     </w:p>
     <w:p>
@@ -8702,74 +8592,8 @@
           <w:sz w:val="28"/>
           <w:szCs w:val="28"/>
         </w:rPr>
-        <w:t>Время выполнения:</w:t>
-      </w:r>
-      <w:r>
-        <w:rPr>
-          <w:sz w:val="28"/>
-          <w:szCs w:val="28"/>
-        </w:rPr>
-        <w:t xml:space="preserve"> </w:t>
-      </w:r>
-    </w:p>
-    <w:p>
-      <w:pPr>
-        <w:spacing w:before="250"/>
-        <w:ind w:left="720"/>
-        <w:rPr>
-          <w:sz w:val="28"/>
-          <w:szCs w:val="28"/>
-        </w:rPr>
-      </w:pPr>
-      <w:r>
-        <w:rPr>
-          <w:sz w:val="28"/>
-          <w:szCs w:val="28"/>
-        </w:rPr>
-        <w:t xml:space="preserve">0.0006167888641357422 </w:t>
-      </w:r>
-      <w:proofErr w:type="spellStart"/>
-      <w:r>
-        <w:rPr>
-          <w:sz w:val="28"/>
-          <w:szCs w:val="28"/>
-        </w:rPr>
-        <w:t>seconds</w:t>
-      </w:r>
-      <w:proofErr w:type="spellEnd"/>
-      <w:r>
-        <w:rPr>
-          <w:sz w:val="28"/>
-          <w:szCs w:val="28"/>
-        </w:rPr>
-        <w:t xml:space="preserve"> - </w:t>
-      </w:r>
-      <w:r>
-        <w:rPr>
-          <w:sz w:val="28"/>
-          <w:szCs w:val="28"/>
-        </w:rPr>
-        <w:t xml:space="preserve">0.0011873245239257812 </w:t>
-      </w:r>
-      <w:proofErr w:type="spellStart"/>
-      <w:r>
-        <w:rPr>
-          <w:sz w:val="28"/>
-          <w:szCs w:val="28"/>
-        </w:rPr>
-        <w:t>seconds</w:t>
-      </w:r>
-      <w:proofErr w:type="spellEnd"/>
-    </w:p>
-    <w:p>
-      <w:pPr>
-        <w:spacing w:before="250"/>
-        <w:ind w:left="720"/>
-        <w:rPr>
-          <w:sz w:val="28"/>
-          <w:szCs w:val="28"/>
-        </w:rPr>
-      </w:pPr>
+        <w:t>0.0006167888641357422 seconds - 0.0011873245239257812 seconds</w:t>
+      </w:r>
     </w:p>
     <w:p>
       <w:pPr>
@@ -8799,6 +8623,7 @@
           <w:sz w:val="28"/>
           <w:szCs w:val="28"/>
         </w:rPr>
+        <w:lastRenderedPageBreak/>
         <w:t>Расширенный бинарный алгоритм Евклида</w:t>
       </w:r>
     </w:p>
@@ -10821,21 +10646,12 @@
           <w:szCs w:val="28"/>
         </w:rPr>
       </w:pPr>
-      <w:proofErr w:type="gramStart"/>
-      <w:r>
-        <w:rPr>
-          <w:sz w:val="28"/>
-          <w:szCs w:val="28"/>
-        </w:rPr>
-        <w:t>НОД(</w:t>
-      </w:r>
-      <w:proofErr w:type="gramEnd"/>
-      <w:r>
-        <w:rPr>
-          <w:sz w:val="28"/>
-          <w:szCs w:val="28"/>
-        </w:rPr>
-        <w:t>1а, 1б) = 8743126037 = 12567535315337923802×1а + (−88627662480474871905)×1б.</w:t>
+      <w:r>
+        <w:rPr>
+          <w:sz w:val="28"/>
+          <w:szCs w:val="28"/>
+        </w:rPr>
+        <w:t>НОД(1а, 1б) = 8743126037 = 12567535315337923802×1а + (−88627662480474871905)×1б.</w:t>
       </w:r>
     </w:p>
     <w:p>
@@ -10857,6 +10673,54 @@
           <w:szCs w:val="28"/>
         </w:rPr>
       </w:pPr>
+    </w:p>
+    <w:p>
+      <w:pPr>
+        <w:spacing w:before="250"/>
+        <w:ind w:left="720"/>
+        <w:rPr>
+          <w:sz w:val="28"/>
+          <w:szCs w:val="28"/>
+        </w:rPr>
+      </w:pPr>
+      <w:r>
+        <w:rPr>
+          <w:sz w:val="28"/>
+          <w:szCs w:val="28"/>
+        </w:rPr>
+        <w:t xml:space="preserve">Время выполнения: </w:t>
+      </w:r>
+    </w:p>
+    <w:p>
+      <w:pPr>
+        <w:spacing w:before="250"/>
+        <w:ind w:left="720"/>
+        <w:rPr>
+          <w:sz w:val="28"/>
+          <w:szCs w:val="28"/>
+        </w:rPr>
+      </w:pPr>
+      <w:r>
+        <w:rPr>
+          <w:sz w:val="28"/>
+          <w:szCs w:val="28"/>
+        </w:rPr>
+        <w:t>0.0006167888641357422 seconds</w:t>
+      </w:r>
+      <w:r>
+        <w:rPr>
+          <w:sz w:val="28"/>
+          <w:szCs w:val="28"/>
+        </w:rPr>
+        <w:t xml:space="preserve"> - </w:t>
+      </w:r>
+      <w:r>
+        <w:rPr>
+          <w:sz w:val="28"/>
+          <w:szCs w:val="28"/>
+        </w:rPr>
+        <w:t>0.0011873245239257812 seconds</w:t>
+      </w:r>
     </w:p>
     <w:p>
       <w:pPr>
@@ -13632,21 +13496,12 @@
           <w:szCs w:val="28"/>
         </w:rPr>
       </w:pPr>
-      <w:proofErr w:type="gramStart"/>
-      <w:r>
-        <w:rPr>
-          <w:sz w:val="28"/>
-          <w:szCs w:val="28"/>
-        </w:rPr>
-        <w:t>НОД(</w:t>
-      </w:r>
-      <w:proofErr w:type="gramEnd"/>
-      <w:r>
-        <w:rPr>
-          <w:sz w:val="28"/>
-          <w:szCs w:val="28"/>
-        </w:rPr>
-        <w:t>2а, 2б) = 30876977401637594503 = 259495416326054294611288594244942118500×2а + (−688792290050314114734436108658578431847)×2б.</w:t>
+      <w:r>
+        <w:rPr>
+          <w:sz w:val="28"/>
+          <w:szCs w:val="28"/>
+        </w:rPr>
+        <w:t>НОД(2а, 2б) = 30876977401637594503 = 259495416326054294611288594244942118500×2а + (−688792290050314114734436108658578431847)×2б.</w:t>
       </w:r>
     </w:p>
     <w:p>
@@ -16773,22 +16628,13 @@
           <w:szCs w:val="28"/>
         </w:rPr>
       </w:pPr>
-      <w:proofErr w:type="gramStart"/>
       <w:r>
         <w:rPr>
           <w:sz w:val="28"/>
           <w:szCs w:val="28"/>
         </w:rPr>
         <w:lastRenderedPageBreak/>
-        <w:t>НОД(</w:t>
-      </w:r>
-      <w:proofErr w:type="gramEnd"/>
-      <w:r>
-        <w:rPr>
-          <w:sz w:val="28"/>
-          <w:szCs w:val="28"/>
-        </w:rPr>
-        <w:t>3а, 3б) = 9947196241514273871557554821948771026521 = 85738929038544571561370281327474117401211009717617068223120019755447015119997634×3а + (−14114875556182689032619635064471409755737221996636862834622031077484424333414751)×3б.</w:t>
+        <w:t>НОД(3а, 3б) = 9947196241514273871557554821948771026521 = 85738929038544571561370281327474117401211009717617068223120019755447015119997634×3а + (−14114875556182689032619635064471409755737221996636862834622031077484424333414751)×3б.</w:t>
       </w:r>
     </w:p>
     <w:p>
@@ -16803,7 +16649,6 @@
         <w:rPr>
           <w:sz w:val="28"/>
           <w:szCs w:val="28"/>
-          <w:lang w:val="en-US"/>
         </w:rPr>
         <w:tab/>
       </w:r>
@@ -16818,7 +16663,6 @@
         <w:rPr>
           <w:sz w:val="28"/>
           <w:szCs w:val="28"/>
-          <w:lang w:val="en-US"/>
         </w:rPr>
         <w:t xml:space="preserve"> </w:t>
       </w:r>
@@ -16833,7 +16677,6 @@
         <w:rPr>
           <w:sz w:val="28"/>
           <w:szCs w:val="28"/>
-          <w:lang w:val="en-US"/>
         </w:rPr>
         <w:t>:</w:t>
       </w:r>
@@ -16851,25 +16694,16 @@
         <w:rPr>
           <w:sz w:val="28"/>
           <w:szCs w:val="28"/>
+        </w:rPr>
+        <w:t xml:space="preserve"> </w:t>
+      </w:r>
+      <w:r>
+        <w:rPr>
+          <w:sz w:val="28"/>
+          <w:szCs w:val="28"/>
           <w:lang w:val="en-US"/>
         </w:rPr>
-        <w:t xml:space="preserve"> </w:t>
-      </w:r>
-      <w:r>
-        <w:rPr>
-          <w:sz w:val="28"/>
-          <w:szCs w:val="28"/>
-          <w:lang w:val="en-US"/>
-        </w:rPr>
-        <w:t>0.000484466552734375 seconds</w:t>
-      </w:r>
-      <w:r>
-        <w:rPr>
-          <w:sz w:val="28"/>
-          <w:szCs w:val="28"/>
-          <w:lang w:val="en-US"/>
-        </w:rPr>
-        <w:t xml:space="preserve"> - </w:t>
+        <w:t xml:space="preserve">0.000484466552734375 seconds - </w:t>
       </w:r>
       <w:r>
         <w:rPr>
@@ -19077,21 +18911,12 @@
           <w:szCs w:val="28"/>
         </w:rPr>
       </w:pPr>
-      <w:proofErr w:type="gramStart"/>
-      <w:r>
-        <w:rPr>
-          <w:sz w:val="28"/>
-          <w:szCs w:val="28"/>
-        </w:rPr>
-        <w:t>НОД(</w:t>
-      </w:r>
-      <w:proofErr w:type="gramEnd"/>
-      <w:r>
-        <w:rPr>
-          <w:sz w:val="28"/>
-          <w:szCs w:val="28"/>
-        </w:rPr>
-        <w:t>1а, 1б) = 8743126037 = (−483443118)×1а + 3409294855×1б.</w:t>
+      <w:r>
+        <w:rPr>
+          <w:sz w:val="28"/>
+          <w:szCs w:val="28"/>
+        </w:rPr>
+        <w:t>НОД(1а, 1б) = 8743126037 = (−483443118)×1а + 3409294855×1б.</w:t>
       </w:r>
     </w:p>
     <w:p>
@@ -22266,21 +22091,12 @@
           <w:szCs w:val="28"/>
         </w:rPr>
       </w:pPr>
-      <w:proofErr w:type="gramStart"/>
-      <w:r>
-        <w:rPr>
-          <w:sz w:val="28"/>
-          <w:szCs w:val="28"/>
-        </w:rPr>
-        <w:t>НОД(</w:t>
-      </w:r>
-      <w:proofErr w:type="gramEnd"/>
-      <w:r>
-        <w:rPr>
-          <w:sz w:val="28"/>
-          <w:szCs w:val="28"/>
-        </w:rPr>
-        <w:t>2а, 2б) = 30876977401637594503 = 3085669097721263226×2а + (−8190453281403564065)×2б.</w:t>
+      <w:r>
+        <w:rPr>
+          <w:sz w:val="28"/>
+          <w:szCs w:val="28"/>
+        </w:rPr>
+        <w:t>НОД(2а, 2б) = 30876977401637594503 = 3085669097721263226×2а + (−8190453281403564065)×2б.</w:t>
       </w:r>
     </w:p>
     <w:p>
@@ -24877,21 +24693,12 @@
           <w:szCs w:val="28"/>
         </w:rPr>
       </w:pPr>
-      <w:proofErr w:type="gramStart"/>
-      <w:r>
-        <w:rPr>
-          <w:sz w:val="28"/>
-          <w:szCs w:val="28"/>
-        </w:rPr>
-        <w:t>НОД(</w:t>
-      </w:r>
-      <w:proofErr w:type="gramEnd"/>
-      <w:r>
-        <w:rPr>
-          <w:sz w:val="28"/>
-          <w:szCs w:val="28"/>
-        </w:rPr>
-        <w:t>3а, 3б) = 9947196241514273871557554821948771026521 = (−444607229851835625082808735769956835954)×3а + 73194006399549747272884706990611853645×3б.</w:t>
+      <w:r>
+        <w:rPr>
+          <w:sz w:val="28"/>
+          <w:szCs w:val="28"/>
+        </w:rPr>
+        <w:t>НОД(3а, 3б) = 9947196241514273871557554821948771026521 = (−444607229851835625082808735769956835954)×3а + 73194006399549747272884706990611853645×3б.</w:t>
       </w:r>
     </w:p>
     <w:p>
@@ -24924,17 +24731,8 @@
           <w:szCs w:val="28"/>
         </w:rPr>
         <w:lastRenderedPageBreak/>
-        <w:t xml:space="preserve">0.0005068778991699219 </w:t>
-      </w:r>
-      <w:proofErr w:type="spellStart"/>
-      <w:r>
-        <w:rPr>
-          <w:sz w:val="28"/>
-          <w:szCs w:val="28"/>
-        </w:rPr>
-        <w:t>seconds</w:t>
-      </w:r>
-      <w:proofErr w:type="spellEnd"/>
+        <w:t>0.0005068778991699219 seconds</w:t>
+      </w:r>
       <w:r>
         <w:rPr>
           <w:sz w:val="28"/>
@@ -24947,17 +24745,8 @@
           <w:sz w:val="28"/>
           <w:szCs w:val="28"/>
         </w:rPr>
-        <w:t xml:space="preserve">0.0010640621185302734 </w:t>
-      </w:r>
-      <w:proofErr w:type="spellStart"/>
-      <w:r>
-        <w:rPr>
-          <w:sz w:val="28"/>
-          <w:szCs w:val="28"/>
-        </w:rPr>
-        <w:t>seconds</w:t>
-      </w:r>
-      <w:proofErr w:type="spellEnd"/>
+        <w:t>0.0010640621185302734 seconds</w:t>
+      </w:r>
     </w:p>
     <w:p>
       <w:pPr>
@@ -24970,13 +24759,270 @@
     </w:p>
     <w:p>
       <w:pPr>
+        <w:pStyle w:val="a7"/>
+        <w:numPr>
+          <w:ilvl w:val="0"/>
+          <w:numId w:val="2"/>
+        </w:numPr>
         <w:spacing w:before="250"/>
         <w:rPr>
           <w:sz w:val="28"/>
           <w:szCs w:val="28"/>
+          <w:lang w:val="en-US"/>
         </w:rPr>
       </w:pPr>
+      <w:r>
+        <w:rPr>
+          <w:sz w:val="28"/>
+          <w:szCs w:val="28"/>
+        </w:rPr>
+        <w:t xml:space="preserve">Замеры времени </w:t>
+      </w:r>
     </w:p>
+    <w:tbl>
+      <w:tblPr>
+        <w:tblStyle w:val="ae"/>
+        <w:tblW w:w="0" w:type="auto"/>
+        <w:tblLook w:val="04A0" w:firstRow="1" w:lastRow="0" w:firstColumn="1" w:lastColumn="0" w:noHBand="0" w:noVBand="1"/>
+      </w:tblPr>
+      <w:tblGrid>
+        <w:gridCol w:w="3115"/>
+        <w:gridCol w:w="3115"/>
+        <w:gridCol w:w="3115"/>
+      </w:tblGrid>
+      <w:tr>
+        <w:tc>
+          <w:tcPr>
+            <w:tcW w:w="3115" w:type="dxa"/>
+          </w:tcPr>
+          <w:p>
+            <w:pPr>
+              <w:spacing w:before="250"/>
+              <w:rPr>
+                <w:sz w:val="28"/>
+                <w:szCs w:val="28"/>
+              </w:rPr>
+            </w:pPr>
+            <w:r>
+              <w:rPr>
+                <w:sz w:val="28"/>
+                <w:szCs w:val="28"/>
+              </w:rPr>
+              <w:t>Расширенный алгоритм Евклида</w:t>
+            </w:r>
+          </w:p>
+        </w:tc>
+        <w:tc>
+          <w:tcPr>
+            <w:tcW w:w="3115" w:type="dxa"/>
+          </w:tcPr>
+          <w:p>
+            <w:pPr>
+              <w:spacing w:before="250"/>
+              <w:rPr>
+                <w:sz w:val="28"/>
+                <w:szCs w:val="28"/>
+              </w:rPr>
+            </w:pPr>
+            <w:r>
+              <w:rPr>
+                <w:sz w:val="28"/>
+                <w:szCs w:val="28"/>
+              </w:rPr>
+              <w:t>Расширенный бинарный алгоритм Евклида</w:t>
+            </w:r>
+          </w:p>
+        </w:tc>
+        <w:tc>
+          <w:tcPr>
+            <w:tcW w:w="3115" w:type="dxa"/>
+          </w:tcPr>
+          <w:p>
+            <w:pPr>
+              <w:spacing w:before="250"/>
+              <w:rPr>
+                <w:sz w:val="28"/>
+                <w:szCs w:val="28"/>
+              </w:rPr>
+            </w:pPr>
+            <w:r>
+              <w:rPr>
+                <w:sz w:val="28"/>
+                <w:szCs w:val="28"/>
+              </w:rPr>
+              <w:t>Расширенный алгоритм Евклида с усеченными остатками</w:t>
+            </w:r>
+          </w:p>
+        </w:tc>
+      </w:tr>
+      <w:tr>
+        <w:tc>
+          <w:tcPr>
+            <w:tcW w:w="3115" w:type="dxa"/>
+          </w:tcPr>
+          <w:p>
+            <w:pPr>
+              <w:spacing w:before="250"/>
+              <w:rPr>
+                <w:sz w:val="28"/>
+                <w:szCs w:val="28"/>
+              </w:rPr>
+            </w:pPr>
+            <w:r>
+              <w:rPr>
+                <w:sz w:val="28"/>
+                <w:szCs w:val="28"/>
+              </w:rPr>
+              <w:t>0.0006167888641357422</w:t>
+            </w:r>
+          </w:p>
+          <w:p>
+            <w:pPr>
+              <w:spacing w:before="250"/>
+              <w:rPr>
+                <w:sz w:val="28"/>
+                <w:szCs w:val="28"/>
+                <w:lang w:val="en-US"/>
+              </w:rPr>
+            </w:pPr>
+            <w:r>
+              <w:rPr>
+                <w:sz w:val="28"/>
+                <w:szCs w:val="28"/>
+                <w:lang w:val="en-US"/>
+              </w:rPr>
+              <w:t>0.0006604194641113281</w:t>
+            </w:r>
+          </w:p>
+          <w:p>
+            <w:pPr>
+              <w:spacing w:before="250"/>
+              <w:rPr>
+                <w:sz w:val="28"/>
+                <w:szCs w:val="28"/>
+              </w:rPr>
+            </w:pPr>
+            <w:r>
+              <w:rPr>
+                <w:sz w:val="28"/>
+                <w:szCs w:val="28"/>
+              </w:rPr>
+              <w:t>0.0011873245239257812</w:t>
+            </w:r>
+          </w:p>
+        </w:tc>
+        <w:tc>
+          <w:tcPr>
+            <w:tcW w:w="3115" w:type="dxa"/>
+          </w:tcPr>
+          <w:p>
+            <w:pPr>
+              <w:spacing w:before="250"/>
+              <w:rPr>
+                <w:sz w:val="28"/>
+                <w:szCs w:val="28"/>
+              </w:rPr>
+            </w:pPr>
+            <w:r>
+              <w:rPr>
+                <w:sz w:val="28"/>
+                <w:szCs w:val="28"/>
+              </w:rPr>
+              <w:t>0.000484466552734375</w:t>
+            </w:r>
+          </w:p>
+          <w:p>
+            <w:pPr>
+              <w:spacing w:before="250"/>
+              <w:rPr>
+                <w:sz w:val="28"/>
+                <w:szCs w:val="28"/>
+                <w:lang w:val="en-US"/>
+              </w:rPr>
+            </w:pPr>
+            <w:r>
+              <w:rPr>
+                <w:sz w:val="28"/>
+                <w:szCs w:val="28"/>
+                <w:lang w:val="en-US"/>
+              </w:rPr>
+              <w:t>0.0022706985473632812</w:t>
+            </w:r>
+          </w:p>
+          <w:p>
+            <w:pPr>
+              <w:spacing w:before="250"/>
+              <w:rPr>
+                <w:sz w:val="28"/>
+                <w:szCs w:val="28"/>
+              </w:rPr>
+            </w:pPr>
+            <w:r>
+              <w:rPr>
+                <w:sz w:val="28"/>
+                <w:szCs w:val="28"/>
+              </w:rPr>
+              <w:t>0.009949207305908203</w:t>
+            </w:r>
+          </w:p>
+        </w:tc>
+        <w:tc>
+          <w:tcPr>
+            <w:tcW w:w="3115" w:type="dxa"/>
+          </w:tcPr>
+          <w:p>
+            <w:pPr>
+              <w:spacing w:before="250"/>
+              <w:rPr>
+                <w:sz w:val="28"/>
+                <w:szCs w:val="28"/>
+              </w:rPr>
+            </w:pPr>
+            <w:r>
+              <w:rPr>
+                <w:sz w:val="28"/>
+                <w:szCs w:val="28"/>
+              </w:rPr>
+              <w:t>0.0005068778991699219</w:t>
+            </w:r>
+          </w:p>
+          <w:p>
+            <w:pPr>
+              <w:spacing w:before="250"/>
+              <w:rPr>
+                <w:sz w:val="28"/>
+                <w:szCs w:val="28"/>
+                <w:lang w:val="en-US"/>
+              </w:rPr>
+            </w:pPr>
+            <w:r>
+              <w:rPr>
+                <w:sz w:val="28"/>
+                <w:szCs w:val="28"/>
+                <w:lang w:val="en-US"/>
+              </w:rPr>
+              <w:t>0.0005276203155517578</w:t>
+            </w:r>
+          </w:p>
+          <w:p>
+            <w:pPr>
+              <w:spacing w:before="250"/>
+              <w:rPr>
+                <w:sz w:val="28"/>
+                <w:szCs w:val="28"/>
+              </w:rPr>
+            </w:pPr>
+            <w:r>
+              <w:rPr>
+                <w:sz w:val="28"/>
+                <w:szCs w:val="28"/>
+              </w:rPr>
+              <w:t>0.0010640621185302734</w:t>
+            </w:r>
+          </w:p>
+        </w:tc>
+      </w:tr>
+    </w:tbl>
     <w:p>
       <w:pPr>
         <w:spacing w:before="250"/>
@@ -25194,7 +25240,6 @@
           <w:sz w:val="28"/>
           <w:szCs w:val="28"/>
         </w:rPr>
-        <w:lastRenderedPageBreak/>
         <w:t xml:space="preserve">Обоснование корректности </w:t>
       </w:r>
       <w:r>
@@ -25536,14 +25581,7 @@
           <w:sz w:val="28"/>
           <w:szCs w:val="28"/>
         </w:rPr>
-        <w:t xml:space="preserve"> </w:t>
-      </w:r>
-      <w:r>
-        <w:rPr>
-          <w:sz w:val="28"/>
-          <w:szCs w:val="28"/>
-        </w:rPr>
-        <w:t>для некоторого целого k.</w:t>
+        <w:t xml:space="preserve"> для некоторого целого k.</w:t>
       </w:r>
     </w:p>
     <w:p>
@@ -25582,23 +25620,7 @@
           <w:sz w:val="28"/>
           <w:szCs w:val="28"/>
         </w:rPr>
-        <w:t>(u₂−u</w:t>
-      </w:r>
-      <w:proofErr w:type="gramStart"/>
-      <w:r>
-        <w:rPr>
-          <w:sz w:val="28"/>
-          <w:szCs w:val="28"/>
-        </w:rPr>
-        <w:t>₁)·</w:t>
-      </w:r>
-      <w:proofErr w:type="gramEnd"/>
-      <w:r>
-        <w:rPr>
-          <w:sz w:val="28"/>
-          <w:szCs w:val="28"/>
-        </w:rPr>
-        <w:t>a + (v₂−v₁)·b = d − d = 0</w:t>
+        <w:t>(u₂−u₁)·a + (v₂−v₁)·b = d − d = 0</w:t>
       </w:r>
       <w:r>
         <w:rPr>
@@ -25624,7 +25646,6 @@
         </w:rPr>
         <w:t xml:space="preserve">Разделим обе части на </w:t>
       </w:r>
-      <w:proofErr w:type="gramStart"/>
       <w:r>
         <w:rPr>
           <w:sz w:val="28"/>
@@ -25640,22 +25661,12 @@
         </w:rPr>
         <w:t>(</w:t>
       </w:r>
-      <w:proofErr w:type="spellStart"/>
-      <w:proofErr w:type="gramEnd"/>
-      <w:r>
-        <w:rPr>
-          <w:sz w:val="28"/>
-          <w:szCs w:val="28"/>
-        </w:rPr>
-        <w:t>тк</w:t>
-      </w:r>
-      <w:proofErr w:type="spellEnd"/>
-      <w:r>
-        <w:rPr>
-          <w:sz w:val="28"/>
-          <w:szCs w:val="28"/>
-        </w:rPr>
-        <w:t xml:space="preserve"> </w:t>
+      <w:r>
+        <w:rPr>
+          <w:sz w:val="28"/>
+          <w:szCs w:val="28"/>
+        </w:rPr>
+        <w:t xml:space="preserve">тк </w:t>
       </w:r>
       <w:r>
         <w:rPr>
@@ -25775,7 +25786,6 @@
         <w:rPr>
           <w:sz w:val="28"/>
           <w:szCs w:val="28"/>
-          <w:lang w:val="en-US"/>
         </w:rPr>
       </w:pPr>
       <w:r>
@@ -25783,23 +25793,7 @@
           <w:sz w:val="28"/>
           <w:szCs w:val="28"/>
         </w:rPr>
-        <w:t>(u₂−u</w:t>
-      </w:r>
-      <w:proofErr w:type="gramStart"/>
-      <w:r>
-        <w:rPr>
-          <w:sz w:val="28"/>
-          <w:szCs w:val="28"/>
-        </w:rPr>
-        <w:t>₁)·</w:t>
-      </w:r>
-      <w:proofErr w:type="gramEnd"/>
-      <w:r>
-        <w:rPr>
-          <w:sz w:val="28"/>
-          <w:szCs w:val="28"/>
-        </w:rPr>
-        <w:t>(a/d) = (v₁−v₂)·(b/d)</w:t>
+        <w:t>(u₂−u₁)·(a/d) = (v₁−v₂)·(b/d)</w:t>
       </w:r>
     </w:p>
     <w:p>
@@ -25919,23 +25913,7 @@
           <w:sz w:val="28"/>
           <w:szCs w:val="28"/>
         </w:rPr>
-        <w:t>(u₂−u</w:t>
-      </w:r>
-      <w:proofErr w:type="gramStart"/>
-      <w:r>
-        <w:rPr>
-          <w:sz w:val="28"/>
-          <w:szCs w:val="28"/>
-        </w:rPr>
-        <w:t>₁)·</w:t>
-      </w:r>
-      <w:proofErr w:type="gramEnd"/>
-      <w:r>
-        <w:rPr>
-          <w:sz w:val="28"/>
-          <w:szCs w:val="28"/>
-        </w:rPr>
-        <w:t>(a/d)</w:t>
+        <w:t>(u₂−u₁)·(a/d)</w:t>
       </w:r>
       <w:r>
         <w:rPr>
@@ -26152,23 +26130,7 @@
           <w:sz w:val="28"/>
           <w:szCs w:val="28"/>
         </w:rPr>
-        <w:t xml:space="preserve">Были реализованы следующие алгоритмы: 1. Расширенный алгоритм Евклида. 2. Расширенный бинарный алгоритм Евклида. 3. Расширенный алгоритм Евклида с «усечёнными» остатками. Протестированы на парах чисел данных в </w:t>
-      </w:r>
-      <w:proofErr w:type="spellStart"/>
-      <w:r>
-        <w:rPr>
-          <w:sz w:val="28"/>
-          <w:szCs w:val="28"/>
-        </w:rPr>
-        <w:t>варинате</w:t>
-      </w:r>
-      <w:proofErr w:type="spellEnd"/>
-      <w:r>
-        <w:rPr>
-          <w:sz w:val="28"/>
-          <w:szCs w:val="28"/>
-        </w:rPr>
-        <w:t>. Проведено сравнение алгоритмов по быстродействию.</w:t>
+        <w:t>Были реализованы следующие алгоритмы: 1. Расширенный алгоритм Евклида. 2. Расширенный бинарный алгоритм Евклида. 3. Расширенный алгоритм Евклида с «усечёнными» остатками. Протестированы на парах чисел данных в варинате. Проведено сравнение алгоритмов по быстродействию.</w:t>
       </w:r>
     </w:p>
     <w:sectPr>
@@ -27267,6 +27229,7 @@
   <w:style w:type="character" w:default="1" w:styleId="a0">
     <w:name w:val="Default Paragraph Font"/>
     <w:uiPriority w:val="1"/>
+    <w:semiHidden/>
     <w:unhideWhenUsed/>
   </w:style>
   <w:style w:type="table" w:default="1" w:styleId="a1">
@@ -27605,6 +27568,25 @@
       <w14:ligatures w14:val="none"/>
     </w:rPr>
   </w:style>
+  <w:style w:type="table" w:styleId="ae">
+    <w:name w:val="Table Grid"/>
+    <w:basedOn w:val="a1"/>
+    <w:uiPriority w:val="39"/>
+    <w:rsid w:val="008B454E"/>
+    <w:pPr>
+      <w:spacing w:after="0" w:line="240" w:lineRule="auto"/>
+    </w:pPr>
+    <w:tblPr>
+      <w:tblBorders>
+        <w:top w:val="single" w:sz="4" w:space="0" w:color="auto"/>
+        <w:left w:val="single" w:sz="4" w:space="0" w:color="auto"/>
+        <w:bottom w:val="single" w:sz="4" w:space="0" w:color="auto"/>
+        <w:right w:val="single" w:sz="4" w:space="0" w:color="auto"/>
+        <w:insideH w:val="single" w:sz="4" w:space="0" w:color="auto"/>
+        <w:insideV w:val="single" w:sz="4" w:space="0" w:color="auto"/>
+      </w:tblBorders>
+    </w:tblPr>
+  </w:style>
 </w:styles>
 </file>
 

</xml_diff>

<commit_message>
vault backup: 2026-09-16 23:12:37
</commit_message>
<xml_diff>
--- a/Учеба 5 семестр/КРИПТА/1 ЛАБ/Отчет.docx
+++ b/Учеба 5 семестр/КРИПТА/1 ЛАБ/Отчет.docx
@@ -908,7 +908,23 @@
           <w:sz w:val="28"/>
           <w:szCs w:val="28"/>
         </w:rPr>
-        <w:t xml:space="preserve">Для каждой пары чисел из варианта задания найти наибольший общий делитель и его линейное представление, используя следуюющие </w:t>
+        <w:t xml:space="preserve">Для каждой пары чисел из варианта задания найти наибольший общий делитель и его линейное представление, используя </w:t>
+      </w:r>
+      <w:proofErr w:type="spellStart"/>
+      <w:r>
+        <w:rPr>
+          <w:sz w:val="28"/>
+          <w:szCs w:val="28"/>
+        </w:rPr>
+        <w:t>следуюющие</w:t>
+      </w:r>
+      <w:proofErr w:type="spellEnd"/>
+      <w:r>
+        <w:rPr>
+          <w:sz w:val="28"/>
+          <w:szCs w:val="28"/>
+        </w:rPr>
+        <w:t xml:space="preserve"> </w:t>
       </w:r>
       <w:r>
         <w:rPr>
@@ -1216,7 +1232,21 @@
         <w:rPr>
           <w:sz w:val="28"/>
         </w:rPr>
-        <w:t xml:space="preserve"> – находит НОД пары чисел (a,b). </w:t>
+        <w:t> – находит НОД пары чисел (</w:t>
+      </w:r>
+      <w:proofErr w:type="spellStart"/>
+      <w:r>
+        <w:rPr>
+          <w:sz w:val="28"/>
+        </w:rPr>
+        <w:t>a,b</w:t>
+      </w:r>
+      <w:proofErr w:type="spellEnd"/>
+      <w:r>
+        <w:rPr>
+          <w:sz w:val="28"/>
+        </w:rPr>
+        <w:t xml:space="preserve">). </w:t>
       </w:r>
     </w:p>
     <w:p>
@@ -1242,7 +1272,49 @@
         <w:rPr>
           <w:sz w:val="28"/>
         </w:rPr>
-        <w:t>- расширенная версия, которая вдобавок к НОД считает пару коэффициентов u, v таких, что НОД(a,b) = u·a + v·b.</w:t>
+        <w:t>- расширенная версия, которая вдобавок к НОД считает пару коэффициентов u, v таких, что НОД(</w:t>
+      </w:r>
+      <w:proofErr w:type="spellStart"/>
+      <w:r>
+        <w:rPr>
+          <w:sz w:val="28"/>
+        </w:rPr>
+        <w:t>a,b</w:t>
+      </w:r>
+      <w:proofErr w:type="spellEnd"/>
+      <w:r>
+        <w:rPr>
+          <w:sz w:val="28"/>
+        </w:rPr>
+        <w:t xml:space="preserve">) = </w:t>
+      </w:r>
+      <w:proofErr w:type="spellStart"/>
+      <w:r>
+        <w:rPr>
+          <w:sz w:val="28"/>
+        </w:rPr>
+        <w:t>u·a</w:t>
+      </w:r>
+      <w:proofErr w:type="spellEnd"/>
+      <w:r>
+        <w:rPr>
+          <w:sz w:val="28"/>
+        </w:rPr>
+        <w:t xml:space="preserve"> + </w:t>
+      </w:r>
+      <w:proofErr w:type="spellStart"/>
+      <w:r>
+        <w:rPr>
+          <w:sz w:val="28"/>
+        </w:rPr>
+        <w:t>v·b</w:t>
+      </w:r>
+      <w:proofErr w:type="spellEnd"/>
+      <w:r>
+        <w:rPr>
+          <w:sz w:val="28"/>
+        </w:rPr>
+        <w:t>.</w:t>
       </w:r>
     </w:p>
     <w:p>
@@ -8568,6 +8640,7 @@
         <w:rPr>
           <w:sz w:val="28"/>
           <w:szCs w:val="28"/>
+          <w:lang w:val="en-US"/>
         </w:rPr>
       </w:pPr>
       <w:r>
@@ -8575,7 +8648,75 @@
           <w:sz w:val="28"/>
           <w:szCs w:val="28"/>
         </w:rPr>
-        <w:t>НОД(3а, 3б) = 9947196241514273871557554821948771026521 = (−444607229851835625082808735769956835954)×3а + 73194006399549747272884706990611853645×3б.</w:t>
+        <w:t>НОД</w:t>
+      </w:r>
+      <w:r>
+        <w:rPr>
+          <w:sz w:val="28"/>
+          <w:szCs w:val="28"/>
+          <w:lang w:val="en-US"/>
+        </w:rPr>
+        <w:t>(3</w:t>
+      </w:r>
+      <w:r>
+        <w:rPr>
+          <w:sz w:val="28"/>
+          <w:szCs w:val="28"/>
+        </w:rPr>
+        <w:t>а</w:t>
+      </w:r>
+      <w:r>
+        <w:rPr>
+          <w:sz w:val="28"/>
+          <w:szCs w:val="28"/>
+          <w:lang w:val="en-US"/>
+        </w:rPr>
+        <w:t>, 3</w:t>
+      </w:r>
+      <w:r>
+        <w:rPr>
+          <w:sz w:val="28"/>
+          <w:szCs w:val="28"/>
+        </w:rPr>
+        <w:t>б</w:t>
+      </w:r>
+      <w:r>
+        <w:rPr>
+          <w:sz w:val="28"/>
+          <w:szCs w:val="28"/>
+          <w:lang w:val="en-US"/>
+        </w:rPr>
+        <w:t>) = 9947196241514273871557554821948771026521 = (−444607229851835625082808735769956835954)×3</w:t>
+      </w:r>
+      <w:r>
+        <w:rPr>
+          <w:sz w:val="28"/>
+          <w:szCs w:val="28"/>
+        </w:rPr>
+        <w:t>а</w:t>
+      </w:r>
+      <w:r>
+        <w:rPr>
+          <w:sz w:val="28"/>
+          <w:szCs w:val="28"/>
+          <w:lang w:val="en-US"/>
+        </w:rPr>
+        <w:t xml:space="preserve"> + 73194006399549747272884706990611853645×3</w:t>
+      </w:r>
+      <w:r>
+        <w:rPr>
+          <w:sz w:val="28"/>
+          <w:szCs w:val="28"/>
+        </w:rPr>
+        <w:t>б</w:t>
+      </w:r>
+      <w:r>
+        <w:rPr>
+          <w:sz w:val="28"/>
+          <w:szCs w:val="28"/>
+          <w:lang w:val="en-US"/>
+        </w:rPr>
+        <w:t>.</w:t>
       </w:r>
     </w:p>
     <w:p>
@@ -8585,12 +8726,14 @@
         <w:rPr>
           <w:sz w:val="28"/>
           <w:szCs w:val="28"/>
+          <w:lang w:val="en-US"/>
         </w:rPr>
       </w:pPr>
       <w:r>
         <w:rPr>
           <w:sz w:val="28"/>
           <w:szCs w:val="28"/>
+          <w:lang w:val="en-US"/>
         </w:rPr>
         <w:t>0.0006167888641357422 seconds - 0.0011873245239257812 seconds</w:t>
       </w:r>
@@ -8602,6 +8745,7 @@
         <w:rPr>
           <w:sz w:val="28"/>
           <w:szCs w:val="28"/>
+          <w:lang w:val="en-US"/>
         </w:rPr>
       </w:pPr>
     </w:p>
@@ -10705,8 +10849,17 @@
           <w:sz w:val="28"/>
           <w:szCs w:val="28"/>
         </w:rPr>
-        <w:t>0.0006167888641357422 seconds</w:t>
-      </w:r>
+        <w:t xml:space="preserve">0.0006167888641357422 </w:t>
+      </w:r>
+      <w:proofErr w:type="spellStart"/>
+      <w:r>
+        <w:rPr>
+          <w:sz w:val="28"/>
+          <w:szCs w:val="28"/>
+        </w:rPr>
+        <w:t>seconds</w:t>
+      </w:r>
+      <w:proofErr w:type="spellEnd"/>
       <w:r>
         <w:rPr>
           <w:sz w:val="28"/>
@@ -10719,8 +10872,17 @@
           <w:sz w:val="28"/>
           <w:szCs w:val="28"/>
         </w:rPr>
-        <w:t>0.0011873245239257812 seconds</w:t>
-      </w:r>
+        <w:t xml:space="preserve">0.0011873245239257812 </w:t>
+      </w:r>
+      <w:proofErr w:type="spellStart"/>
+      <w:r>
+        <w:rPr>
+          <w:sz w:val="28"/>
+          <w:szCs w:val="28"/>
+        </w:rPr>
+        <w:t>seconds</w:t>
+      </w:r>
+      <w:proofErr w:type="spellEnd"/>
     </w:p>
     <w:p>
       <w:pPr>
@@ -24709,13 +24871,6 @@
           <w:szCs w:val="28"/>
         </w:rPr>
       </w:pPr>
-      <w:r>
-        <w:rPr>
-          <w:sz w:val="28"/>
-          <w:szCs w:val="28"/>
-        </w:rPr>
-        <w:t xml:space="preserve">Время выполнения: </w:t>
-      </w:r>
     </w:p>
     <w:p>
       <w:pPr>
@@ -24731,8 +24886,33 @@
           <w:szCs w:val="28"/>
         </w:rPr>
         <w:lastRenderedPageBreak/>
-        <w:t>0.0005068778991699219 seconds</w:t>
-      </w:r>
+        <w:t xml:space="preserve">Время выполнения: </w:t>
+      </w:r>
+    </w:p>
+    <w:p>
+      <w:pPr>
+        <w:spacing w:before="250"/>
+        <w:rPr>
+          <w:sz w:val="28"/>
+          <w:szCs w:val="28"/>
+        </w:rPr>
+      </w:pPr>
+      <w:r>
+        <w:rPr>
+          <w:sz w:val="28"/>
+          <w:szCs w:val="28"/>
+        </w:rPr>
+        <w:t xml:space="preserve">0.0005068778991699219 </w:t>
+      </w:r>
+      <w:proofErr w:type="spellStart"/>
+      <w:r>
+        <w:rPr>
+          <w:sz w:val="28"/>
+          <w:szCs w:val="28"/>
+        </w:rPr>
+        <w:t>seconds</w:t>
+      </w:r>
+      <w:proofErr w:type="spellEnd"/>
       <w:r>
         <w:rPr>
           <w:sz w:val="28"/>
@@ -24745,8 +24925,17 @@
           <w:sz w:val="28"/>
           <w:szCs w:val="28"/>
         </w:rPr>
-        <w:t>0.0010640621185302734 seconds</w:t>
-      </w:r>
+        <w:t xml:space="preserve">0.0010640621185302734 </w:t>
+      </w:r>
+      <w:proofErr w:type="spellStart"/>
+      <w:r>
+        <w:rPr>
+          <w:sz w:val="28"/>
+          <w:szCs w:val="28"/>
+        </w:rPr>
+        <w:t>seconds</w:t>
+      </w:r>
+      <w:proofErr w:type="spellEnd"/>
     </w:p>
     <w:p>
       <w:pPr>
@@ -24786,9 +24975,9 @@
         <w:tblLook w:val="04A0" w:firstRow="1" w:lastRow="0" w:firstColumn="1" w:lastColumn="0" w:noHBand="0" w:noVBand="1"/>
       </w:tblPr>
       <w:tblGrid>
-        <w:gridCol w:w="3115"/>
-        <w:gridCol w:w="3115"/>
-        <w:gridCol w:w="3115"/>
+        <w:gridCol w:w="3121"/>
+        <w:gridCol w:w="3104"/>
+        <w:gridCol w:w="3120"/>
       </w:tblGrid>
       <w:tr>
         <w:tc>
@@ -24868,6 +25057,13 @@
                 <w:szCs w:val="28"/>
               </w:rPr>
             </w:pPr>
+            <w:r>
+              <w:rPr>
+                <w:sz w:val="28"/>
+                <w:szCs w:val="28"/>
+              </w:rPr>
+              <w:t>(1а,1б)</w:t>
+            </w:r>
             <w:r>
               <w:rPr>
                 <w:sz w:val="28"/>
@@ -24889,329 +25085,406 @@
               <w:rPr>
                 <w:sz w:val="28"/>
                 <w:szCs w:val="28"/>
-                <w:lang w:val="en-US"/>
-              </w:rPr>
-              <w:t>0.0006604194641113281</w:t>
-            </w:r>
-          </w:p>
-          <w:p>
-            <w:pPr>
-              <w:spacing w:before="250"/>
+              </w:rPr>
+              <w:t>(</w:t>
+            </w:r>
+            <w:r>
               <w:rPr>
                 <w:sz w:val="28"/>
                 <w:szCs w:val="28"/>
               </w:rPr>
-            </w:pPr>
+              <w:t>2</w:t>
+            </w:r>
             <w:r>
               <w:rPr>
                 <w:sz w:val="28"/>
                 <w:szCs w:val="28"/>
               </w:rPr>
-              <w:t>0.0011873245239257812</w:t>
-            </w:r>
-          </w:p>
-        </w:tc>
-        <w:tc>
-          <w:tcPr>
-            <w:tcW w:w="3115" w:type="dxa"/>
-          </w:tcPr>
-          <w:p>
-            <w:pPr>
-              <w:spacing w:before="250"/>
+              <w:t>а,</w:t>
+            </w:r>
+            <w:r>
               <w:rPr>
                 <w:sz w:val="28"/>
                 <w:szCs w:val="28"/>
               </w:rPr>
-            </w:pPr>
+              <w:t>2</w:t>
+            </w:r>
             <w:r>
               <w:rPr>
                 <w:sz w:val="28"/>
                 <w:szCs w:val="28"/>
               </w:rPr>
-              <w:t>0.000484466552734375</w:t>
-            </w:r>
-          </w:p>
-          <w:p>
-            <w:pPr>
-              <w:spacing w:before="250"/>
+              <w:t>б)</w:t>
+            </w:r>
+            <w:r>
               <w:rPr>
                 <w:sz w:val="28"/>
                 <w:szCs w:val="28"/>
                 <w:lang w:val="en-US"/>
               </w:rPr>
-            </w:pPr>
-            <w:r>
+              <w:t>0.0006604194641113281</w:t>
+            </w:r>
+          </w:p>
+          <w:p>
+            <w:pPr>
+              <w:spacing w:before="250"/>
+              <w:rPr>
+                <w:sz w:val="28"/>
+                <w:szCs w:val="28"/>
+              </w:rPr>
+            </w:pPr>
+            <w:r>
+              <w:rPr>
+                <w:sz w:val="28"/>
+                <w:szCs w:val="28"/>
+              </w:rPr>
+              <w:t>(</w:t>
+            </w:r>
+            <w:r>
+              <w:rPr>
+                <w:sz w:val="28"/>
+                <w:szCs w:val="28"/>
+              </w:rPr>
+              <w:t>3</w:t>
+            </w:r>
+            <w:r>
+              <w:rPr>
+                <w:sz w:val="28"/>
+                <w:szCs w:val="28"/>
+              </w:rPr>
+              <w:t>а,</w:t>
+            </w:r>
+            <w:r>
+              <w:rPr>
+                <w:sz w:val="28"/>
+                <w:szCs w:val="28"/>
+              </w:rPr>
+              <w:t>3</w:t>
+            </w:r>
+            <w:r>
+              <w:rPr>
+                <w:sz w:val="28"/>
+                <w:szCs w:val="28"/>
+              </w:rPr>
+              <w:t>б)</w:t>
+            </w:r>
+            <w:r>
+              <w:rPr>
+                <w:sz w:val="28"/>
+                <w:szCs w:val="28"/>
+              </w:rPr>
+              <w:t>0.0011873245239257812</w:t>
+            </w:r>
+          </w:p>
+        </w:tc>
+        <w:tc>
+          <w:tcPr>
+            <w:tcW w:w="3115" w:type="dxa"/>
+          </w:tcPr>
+          <w:p>
+            <w:pPr>
+              <w:spacing w:before="250"/>
+              <w:rPr>
+                <w:sz w:val="28"/>
+                <w:szCs w:val="28"/>
+              </w:rPr>
+            </w:pPr>
+            <w:r>
+              <w:rPr>
+                <w:sz w:val="28"/>
+                <w:szCs w:val="28"/>
+              </w:rPr>
+              <w:t>(1</w:t>
+            </w:r>
+            <w:r>
+              <w:rPr>
+                <w:sz w:val="28"/>
+                <w:szCs w:val="28"/>
+              </w:rPr>
+              <w:t>в</w:t>
+            </w:r>
+            <w:r>
+              <w:rPr>
+                <w:sz w:val="28"/>
+                <w:szCs w:val="28"/>
+              </w:rPr>
+              <w:t>,1</w:t>
+            </w:r>
+            <w:r>
+              <w:rPr>
+                <w:sz w:val="28"/>
+                <w:szCs w:val="28"/>
+              </w:rPr>
+              <w:t>г</w:t>
+            </w:r>
+            <w:r>
+              <w:rPr>
+                <w:sz w:val="28"/>
+                <w:szCs w:val="28"/>
+              </w:rPr>
+              <w:t>)</w:t>
+            </w:r>
+            <w:r>
+              <w:rPr>
+                <w:sz w:val="28"/>
+                <w:szCs w:val="28"/>
+              </w:rPr>
+              <w:t>0.000484466552734375</w:t>
+            </w:r>
+          </w:p>
+          <w:p>
+            <w:pPr>
+              <w:spacing w:before="250"/>
               <w:rPr>
                 <w:sz w:val="28"/>
                 <w:szCs w:val="28"/>
                 <w:lang w:val="en-US"/>
               </w:rPr>
-              <w:t>0.0022706985473632812</w:t>
-            </w:r>
-          </w:p>
-          <w:p>
-            <w:pPr>
-              <w:spacing w:before="250"/>
+            </w:pPr>
+            <w:r>
               <w:rPr>
                 <w:sz w:val="28"/>
                 <w:szCs w:val="28"/>
               </w:rPr>
-            </w:pPr>
+              <w:t>(</w:t>
+            </w:r>
             <w:r>
               <w:rPr>
                 <w:sz w:val="28"/>
                 <w:szCs w:val="28"/>
               </w:rPr>
-              <w:t>0.009949207305908203</w:t>
-            </w:r>
-          </w:p>
-        </w:tc>
-        <w:tc>
-          <w:tcPr>
-            <w:tcW w:w="3115" w:type="dxa"/>
-          </w:tcPr>
-          <w:p>
-            <w:pPr>
-              <w:spacing w:before="250"/>
+              <w:t>2</w:t>
+            </w:r>
+            <w:r>
               <w:rPr>
                 <w:sz w:val="28"/>
                 <w:szCs w:val="28"/>
               </w:rPr>
-            </w:pPr>
+              <w:t>в,</w:t>
+            </w:r>
             <w:r>
               <w:rPr>
                 <w:sz w:val="28"/>
                 <w:szCs w:val="28"/>
               </w:rPr>
-              <w:t>0.0005068778991699219</w:t>
-            </w:r>
-          </w:p>
-          <w:p>
-            <w:pPr>
-              <w:spacing w:before="250"/>
+              <w:t>2</w:t>
+            </w:r>
+            <w:r>
+              <w:rPr>
+                <w:sz w:val="28"/>
+                <w:szCs w:val="28"/>
+              </w:rPr>
+              <w:t>г)</w:t>
+            </w:r>
+            <w:r>
               <w:rPr>
                 <w:sz w:val="28"/>
                 <w:szCs w:val="28"/>
                 <w:lang w:val="en-US"/>
               </w:rPr>
-            </w:pPr>
-            <w:r>
+              <w:t>0.0022706985473632812</w:t>
+            </w:r>
+          </w:p>
+          <w:p>
+            <w:pPr>
+              <w:spacing w:before="250"/>
+              <w:rPr>
+                <w:sz w:val="28"/>
+                <w:szCs w:val="28"/>
+              </w:rPr>
+            </w:pPr>
+            <w:r>
+              <w:rPr>
+                <w:sz w:val="28"/>
+                <w:szCs w:val="28"/>
+              </w:rPr>
+              <w:t>(</w:t>
+            </w:r>
+            <w:r>
+              <w:rPr>
+                <w:sz w:val="28"/>
+                <w:szCs w:val="28"/>
+              </w:rPr>
+              <w:t>3</w:t>
+            </w:r>
+            <w:r>
+              <w:rPr>
+                <w:sz w:val="28"/>
+                <w:szCs w:val="28"/>
+              </w:rPr>
+              <w:t>в,</w:t>
+            </w:r>
+            <w:r>
+              <w:rPr>
+                <w:sz w:val="28"/>
+                <w:szCs w:val="28"/>
+              </w:rPr>
+              <w:t>3</w:t>
+            </w:r>
+            <w:r>
+              <w:rPr>
+                <w:sz w:val="28"/>
+                <w:szCs w:val="28"/>
+              </w:rPr>
+              <w:t>г)</w:t>
+            </w:r>
+            <w:r>
+              <w:rPr>
+                <w:sz w:val="28"/>
+                <w:szCs w:val="28"/>
+              </w:rPr>
+              <w:t>0.009949207305908203</w:t>
+            </w:r>
+          </w:p>
+        </w:tc>
+        <w:tc>
+          <w:tcPr>
+            <w:tcW w:w="3115" w:type="dxa"/>
+          </w:tcPr>
+          <w:p>
+            <w:pPr>
+              <w:spacing w:before="250"/>
+              <w:rPr>
+                <w:sz w:val="28"/>
+                <w:szCs w:val="28"/>
+              </w:rPr>
+            </w:pPr>
+            <w:r>
+              <w:rPr>
+                <w:sz w:val="28"/>
+                <w:szCs w:val="28"/>
+              </w:rPr>
+              <w:t>(1</w:t>
+            </w:r>
+            <w:r>
+              <w:rPr>
+                <w:sz w:val="28"/>
+                <w:szCs w:val="28"/>
+              </w:rPr>
+              <w:t>д,1е</w:t>
+            </w:r>
+            <w:r>
+              <w:rPr>
+                <w:sz w:val="28"/>
+                <w:szCs w:val="28"/>
+              </w:rPr>
+              <w:t>)</w:t>
+            </w:r>
+            <w:r>
+              <w:rPr>
+                <w:sz w:val="28"/>
+                <w:szCs w:val="28"/>
+              </w:rPr>
+              <w:t>0.0005068778991699219</w:t>
+            </w:r>
+          </w:p>
+          <w:p>
+            <w:pPr>
+              <w:spacing w:before="250"/>
               <w:rPr>
                 <w:sz w:val="28"/>
                 <w:szCs w:val="28"/>
                 <w:lang w:val="en-US"/>
               </w:rPr>
-              <w:t>0.0005276203155517578</w:t>
-            </w:r>
-          </w:p>
-          <w:p>
-            <w:pPr>
-              <w:spacing w:before="250"/>
+            </w:pPr>
+            <w:r>
               <w:rPr>
                 <w:sz w:val="28"/>
                 <w:szCs w:val="28"/>
               </w:rPr>
-            </w:pPr>
+              <w:t>(</w:t>
+            </w:r>
             <w:r>
               <w:rPr>
                 <w:sz w:val="28"/>
                 <w:szCs w:val="28"/>
               </w:rPr>
+              <w:t>2</w:t>
+            </w:r>
+            <w:r>
+              <w:rPr>
+                <w:sz w:val="28"/>
+                <w:szCs w:val="28"/>
+              </w:rPr>
+              <w:t>д,</w:t>
+            </w:r>
+            <w:r>
+              <w:rPr>
+                <w:sz w:val="28"/>
+                <w:szCs w:val="28"/>
+              </w:rPr>
+              <w:t>2</w:t>
+            </w:r>
+            <w:r>
+              <w:rPr>
+                <w:sz w:val="28"/>
+                <w:szCs w:val="28"/>
+              </w:rPr>
+              <w:t>е)</w:t>
+            </w:r>
+            <w:r>
+              <w:rPr>
+                <w:sz w:val="28"/>
+                <w:szCs w:val="28"/>
+                <w:lang w:val="en-US"/>
+              </w:rPr>
+              <w:t>0.0005276203155517578</w:t>
+            </w:r>
+          </w:p>
+          <w:p>
+            <w:pPr>
+              <w:spacing w:before="250"/>
+              <w:rPr>
+                <w:sz w:val="28"/>
+                <w:szCs w:val="28"/>
+              </w:rPr>
+            </w:pPr>
+            <w:r>
+              <w:rPr>
+                <w:sz w:val="28"/>
+                <w:szCs w:val="28"/>
+              </w:rPr>
+              <w:t>(</w:t>
+            </w:r>
+            <w:r>
+              <w:rPr>
+                <w:sz w:val="28"/>
+                <w:szCs w:val="28"/>
+              </w:rPr>
+              <w:t>3</w:t>
+            </w:r>
+            <w:r>
+              <w:rPr>
+                <w:sz w:val="28"/>
+                <w:szCs w:val="28"/>
+              </w:rPr>
+              <w:t>д,</w:t>
+            </w:r>
+            <w:r>
+              <w:rPr>
+                <w:sz w:val="28"/>
+                <w:szCs w:val="28"/>
+              </w:rPr>
+              <w:t>3</w:t>
+            </w:r>
+            <w:r>
+              <w:rPr>
+                <w:sz w:val="28"/>
+                <w:szCs w:val="28"/>
+              </w:rPr>
+              <w:t>е)</w:t>
+            </w:r>
+            <w:r>
+              <w:rPr>
+                <w:sz w:val="28"/>
+                <w:szCs w:val="28"/>
+              </w:rPr>
               <w:t>0.0010640621185302734</w:t>
             </w:r>
           </w:p>
         </w:tc>
       </w:tr>
     </w:tbl>
-    <w:p>
-      <w:pPr>
-        <w:spacing w:before="250"/>
-        <w:rPr>
-          <w:sz w:val="28"/>
-          <w:szCs w:val="28"/>
-        </w:rPr>
-      </w:pPr>
-    </w:p>
-    <w:p>
-      <w:pPr>
-        <w:spacing w:before="250"/>
-        <w:rPr>
-          <w:sz w:val="28"/>
-          <w:szCs w:val="28"/>
-        </w:rPr>
-      </w:pPr>
-    </w:p>
-    <w:p>
-      <w:pPr>
-        <w:spacing w:before="250"/>
-        <w:rPr>
-          <w:sz w:val="28"/>
-          <w:szCs w:val="28"/>
-        </w:rPr>
-      </w:pPr>
-    </w:p>
-    <w:p>
-      <w:pPr>
-        <w:spacing w:before="250"/>
-        <w:rPr>
-          <w:sz w:val="28"/>
-          <w:szCs w:val="28"/>
-        </w:rPr>
-      </w:pPr>
-    </w:p>
-    <w:p>
-      <w:pPr>
-        <w:spacing w:before="250"/>
-        <w:rPr>
-          <w:sz w:val="28"/>
-          <w:szCs w:val="28"/>
-        </w:rPr>
-      </w:pPr>
-    </w:p>
-    <w:p>
-      <w:pPr>
-        <w:spacing w:before="250"/>
-        <w:rPr>
-          <w:sz w:val="28"/>
-          <w:szCs w:val="28"/>
-        </w:rPr>
-      </w:pPr>
-    </w:p>
-    <w:p>
-      <w:pPr>
-        <w:spacing w:before="250"/>
-        <w:rPr>
-          <w:sz w:val="28"/>
-          <w:szCs w:val="28"/>
-        </w:rPr>
-      </w:pPr>
-    </w:p>
-    <w:p>
-      <w:pPr>
-        <w:spacing w:before="250"/>
-        <w:rPr>
-          <w:sz w:val="28"/>
-          <w:szCs w:val="28"/>
-        </w:rPr>
-      </w:pPr>
-    </w:p>
-    <w:p>
-      <w:pPr>
-        <w:spacing w:before="250"/>
-        <w:rPr>
-          <w:sz w:val="28"/>
-          <w:szCs w:val="28"/>
-        </w:rPr>
-      </w:pPr>
-    </w:p>
-    <w:p>
-      <w:pPr>
-        <w:spacing w:before="250"/>
-        <w:rPr>
-          <w:sz w:val="28"/>
-          <w:szCs w:val="28"/>
-        </w:rPr>
-      </w:pPr>
-    </w:p>
-    <w:p>
-      <w:pPr>
-        <w:spacing w:before="250"/>
-        <w:rPr>
-          <w:sz w:val="28"/>
-          <w:szCs w:val="28"/>
-        </w:rPr>
-      </w:pPr>
-    </w:p>
-    <w:p>
-      <w:pPr>
-        <w:spacing w:before="250"/>
-        <w:rPr>
-          <w:sz w:val="28"/>
-          <w:szCs w:val="28"/>
-        </w:rPr>
-      </w:pPr>
-    </w:p>
-    <w:p>
-      <w:pPr>
-        <w:spacing w:before="250"/>
-        <w:rPr>
-          <w:sz w:val="28"/>
-          <w:szCs w:val="28"/>
-        </w:rPr>
-      </w:pPr>
-    </w:p>
-    <w:p>
-      <w:pPr>
-        <w:spacing w:before="250"/>
-        <w:rPr>
-          <w:sz w:val="28"/>
-          <w:szCs w:val="28"/>
-        </w:rPr>
-      </w:pPr>
-    </w:p>
-    <w:p>
-      <w:pPr>
-        <w:spacing w:before="250"/>
-        <w:rPr>
-          <w:sz w:val="28"/>
-          <w:szCs w:val="28"/>
-        </w:rPr>
-      </w:pPr>
-    </w:p>
-    <w:p>
-      <w:pPr>
-        <w:spacing w:before="250"/>
-        <w:rPr>
-          <w:sz w:val="28"/>
-          <w:szCs w:val="28"/>
-        </w:rPr>
-      </w:pPr>
-    </w:p>
-    <w:p>
-      <w:pPr>
-        <w:spacing w:before="250"/>
-        <w:rPr>
-          <w:sz w:val="28"/>
-          <w:szCs w:val="28"/>
-        </w:rPr>
-      </w:pPr>
-    </w:p>
-    <w:p>
-      <w:pPr>
-        <w:spacing w:before="250"/>
-        <w:rPr>
-          <w:sz w:val="28"/>
-          <w:szCs w:val="28"/>
-        </w:rPr>
-      </w:pPr>
-    </w:p>
-    <w:p>
-      <w:pPr>
-        <w:spacing w:before="250"/>
-        <w:rPr>
-          <w:sz w:val="28"/>
-          <w:szCs w:val="28"/>
-        </w:rPr>
-      </w:pPr>
-    </w:p>
-    <w:p>
-      <w:pPr>
-        <w:spacing w:before="250"/>
-        <w:rPr>
-          <w:sz w:val="28"/>
-          <w:szCs w:val="28"/>
-        </w:rPr>
-      </w:pPr>
-    </w:p>
-    <w:p>
-      <w:pPr>
-        <w:spacing w:before="250"/>
-        <w:rPr>
-          <w:sz w:val="28"/>
-          <w:szCs w:val="28"/>
-        </w:rPr>
-      </w:pPr>
-    </w:p>
     <w:p>
       <w:pPr>
         <w:spacing w:before="250"/>
@@ -25661,12 +25934,21 @@
         </w:rPr>
         <w:t>(</w:t>
       </w:r>
-      <w:r>
-        <w:rPr>
-          <w:sz w:val="28"/>
-          <w:szCs w:val="28"/>
-        </w:rPr>
-        <w:t xml:space="preserve">тк </w:t>
+      <w:proofErr w:type="spellStart"/>
+      <w:r>
+        <w:rPr>
+          <w:sz w:val="28"/>
+          <w:szCs w:val="28"/>
+        </w:rPr>
+        <w:t>тк</w:t>
+      </w:r>
+      <w:proofErr w:type="spellEnd"/>
+      <w:r>
+        <w:rPr>
+          <w:sz w:val="28"/>
+          <w:szCs w:val="28"/>
+        </w:rPr>
+        <w:t xml:space="preserve"> </w:t>
       </w:r>
       <w:r>
         <w:rPr>
@@ -26113,6 +26395,7 @@
           <w:sz w:val="28"/>
           <w:szCs w:val="28"/>
         </w:rPr>
+        <w:lastRenderedPageBreak/>
         <w:t xml:space="preserve"> Выводы </w:t>
       </w:r>
     </w:p>
@@ -26130,7 +26413,23 @@
           <w:sz w:val="28"/>
           <w:szCs w:val="28"/>
         </w:rPr>
-        <w:t>Были реализованы следующие алгоритмы: 1. Расширенный алгоритм Евклида. 2. Расширенный бинарный алгоритм Евклида. 3. Расширенный алгоритм Евклида с «усечёнными» остатками. Протестированы на парах чисел данных в варинате. Проведено сравнение алгоритмов по быстродействию.</w:t>
+        <w:t xml:space="preserve">Были реализованы следующие алгоритмы: 1. Расширенный алгоритм Евклида. 2. Расширенный бинарный алгоритм Евклида. 3. Расширенный алгоритм Евклида с «усечёнными» остатками. Протестированы на парах чисел данных в </w:t>
+      </w:r>
+      <w:proofErr w:type="spellStart"/>
+      <w:r>
+        <w:rPr>
+          <w:sz w:val="28"/>
+          <w:szCs w:val="28"/>
+        </w:rPr>
+        <w:t>варинате</w:t>
+      </w:r>
+      <w:proofErr w:type="spellEnd"/>
+      <w:r>
+        <w:rPr>
+          <w:sz w:val="28"/>
+          <w:szCs w:val="28"/>
+        </w:rPr>
+        <w:t>. Проведено сравнение алгоритмов по быстродействию.</w:t>
       </w:r>
     </w:p>
     <w:sectPr>

</xml_diff>